<commit_message>
docs: sync reports with browser screenshots and learning trend
Issue #34：
- 实验一、二报告改用带地址栏的 Mac Chrome 截图（#8）
- 实验二补充学习趋势（T16）实测与“近 14 天”截图，注明 sim_trend 为模拟演示数据
- shoot.mjs 重拍当前页面，概览页只截首屏；重新生成四份报告
- demo.md：汇报前一天用新的 sim_ 账户生成模拟数据；隧道在 Mac 本地终端建立

Co-Authored-By: Claude Opus 5.5 <noreply@anthropic.com>
</commit_message>
<xml_diff>
--- a/docs/reports/实验一_Web框架搭建.docx
+++ b/docs/reports/实验一_Web框架搭建.docx
@@ -4900,8 +4900,8 @@
             <w:r>
               <w:drawing>
                 <wp:inline distT="0" distB="0" distL="0" distR="0">
-                  <wp:extent cx="5016500" cy="2486627"/>
-                  <wp:docPr id="5001" name="home.png"/>
+                  <wp:extent cx="5016500" cy="3902837"/>
+                  <wp:docPr id="5001" name="chrome-home.png"/>
                   <wp:cNvGraphicFramePr>
                     <a:graphicFrameLocks xmlns:a="http://schemas.openxmlformats.org/drawingml/2006/main" noChangeAspect="1"/>
                   </wp:cNvGraphicFramePr>
@@ -4909,7 +4909,7 @@
                     <a:graphicData uri="http://schemas.openxmlformats.org/drawingml/2006/picture">
                       <pic:pic xmlns:pic="http://schemas.openxmlformats.org/drawingml/2006/picture">
                         <pic:nvPicPr>
-                          <pic:cNvPr id="5001" name="home.png"/>
+                          <pic:cNvPr id="5001" name="chrome-home.png"/>
                           <pic:cNvPicPr/>
                         </pic:nvPicPr>
                         <pic:blipFill>
@@ -4921,7 +4921,7 @@
                         <pic:spPr>
                           <a:xfrm>
                             <a:off x="0" y="0"/>
-                            <a:ext cx="5016500" cy="2486627"/>
+                            <a:ext cx="5016500" cy="3902837"/>
                           </a:xfrm>
                           <a:prstGeom prst="rect">
                             <a:avLst/>
@@ -4959,7 +4959,7 @@
                 <w:sz w:val="21"/>
                 <w:szCs w:val="21"/>
               </w:rPr>
-              <w:t xml:space="preserve">图 1  首页（Mac Chrome 经 SSH 隧道访问，网页视口截图）</w:t>
+              <w:t xml:space="preserve">图 1  首页（Mac Chrome 经 SSH 隧道访问，含地址栏）</w:t>
             </w:r>
           </w:p>
           <w:p>
@@ -4978,8 +4978,8 @@
             <w:r>
               <w:drawing>
                 <wp:inline distT="0" distB="0" distL="0" distR="0">
-                  <wp:extent cx="5016500" cy="2486627"/>
-                  <wp:docPr id="5002" name="hello.png"/>
+                  <wp:extent cx="5016500" cy="3709701"/>
+                  <wp:docPr id="5002" name="chrome-lab-hello.png"/>
                   <wp:cNvGraphicFramePr>
                     <a:graphicFrameLocks xmlns:a="http://schemas.openxmlformats.org/drawingml/2006/main" noChangeAspect="1"/>
                   </wp:cNvGraphicFramePr>
@@ -4987,7 +4987,7 @@
                     <a:graphicData uri="http://schemas.openxmlformats.org/drawingml/2006/picture">
                       <pic:pic xmlns:pic="http://schemas.openxmlformats.org/drawingml/2006/picture">
                         <pic:nvPicPr>
-                          <pic:cNvPr id="5002" name="hello.png"/>
+                          <pic:cNvPr id="5002" name="chrome-lab-hello.png"/>
                           <pic:cNvPicPr/>
                         </pic:nvPicPr>
                         <pic:blipFill>
@@ -4999,7 +4999,7 @@
                         <pic:spPr>
                           <a:xfrm>
                             <a:off x="0" y="0"/>
-                            <a:ext cx="5016500" cy="2486627"/>
+                            <a:ext cx="5016500" cy="3709701"/>
                           </a:xfrm>
                           <a:prstGeom prst="rect">
                             <a:avLst/>

</xml_diff>

<commit_message>
docs: sync reports with browser screenshots and learning trend (#35)
Issue #34：
- 实验一、二报告改用带地址栏的 Mac Chrome 截图（#8）
- 实验二补充学习趋势（T16）实测与“近 14 天”截图，注明 sim_trend 为模拟演示数据
- shoot.mjs 重拍当前页面，概览页只截首屏；重新生成四份报告
- demo.md：汇报前一天用新的 sim_ 账户生成模拟数据；隧道在 Mac 本地终端建立

Co-authored-by: Claude Opus 5.5 <noreply@anthropic.com>
</commit_message>
<xml_diff>
--- a/docs/reports/实验一_Web框架搭建.docx
+++ b/docs/reports/实验一_Web框架搭建.docx
@@ -4900,8 +4900,8 @@
             <w:r>
               <w:drawing>
                 <wp:inline distT="0" distB="0" distL="0" distR="0">
-                  <wp:extent cx="5016500" cy="2486627"/>
-                  <wp:docPr id="5001" name="home.png"/>
+                  <wp:extent cx="5016500" cy="3902837"/>
+                  <wp:docPr id="5001" name="chrome-home.png"/>
                   <wp:cNvGraphicFramePr>
                     <a:graphicFrameLocks xmlns:a="http://schemas.openxmlformats.org/drawingml/2006/main" noChangeAspect="1"/>
                   </wp:cNvGraphicFramePr>
@@ -4909,7 +4909,7 @@
                     <a:graphicData uri="http://schemas.openxmlformats.org/drawingml/2006/picture">
                       <pic:pic xmlns:pic="http://schemas.openxmlformats.org/drawingml/2006/picture">
                         <pic:nvPicPr>
-                          <pic:cNvPr id="5001" name="home.png"/>
+                          <pic:cNvPr id="5001" name="chrome-home.png"/>
                           <pic:cNvPicPr/>
                         </pic:nvPicPr>
                         <pic:blipFill>
@@ -4921,7 +4921,7 @@
                         <pic:spPr>
                           <a:xfrm>
                             <a:off x="0" y="0"/>
-                            <a:ext cx="5016500" cy="2486627"/>
+                            <a:ext cx="5016500" cy="3902837"/>
                           </a:xfrm>
                           <a:prstGeom prst="rect">
                             <a:avLst/>
@@ -4959,7 +4959,7 @@
                 <w:sz w:val="21"/>
                 <w:szCs w:val="21"/>
               </w:rPr>
-              <w:t xml:space="preserve">图 1  首页（Mac Chrome 经 SSH 隧道访问，网页视口截图）</w:t>
+              <w:t xml:space="preserve">图 1  首页（Mac Chrome 经 SSH 隧道访问，含地址栏）</w:t>
             </w:r>
           </w:p>
           <w:p>
@@ -4978,8 +4978,8 @@
             <w:r>
               <w:drawing>
                 <wp:inline distT="0" distB="0" distL="0" distR="0">
-                  <wp:extent cx="5016500" cy="2486627"/>
-                  <wp:docPr id="5002" name="hello.png"/>
+                  <wp:extent cx="5016500" cy="3709701"/>
+                  <wp:docPr id="5002" name="chrome-lab-hello.png"/>
                   <wp:cNvGraphicFramePr>
                     <a:graphicFrameLocks xmlns:a="http://schemas.openxmlformats.org/drawingml/2006/main" noChangeAspect="1"/>
                   </wp:cNvGraphicFramePr>
@@ -4987,7 +4987,7 @@
                     <a:graphicData uri="http://schemas.openxmlformats.org/drawingml/2006/picture">
                       <pic:pic xmlns:pic="http://schemas.openxmlformats.org/drawingml/2006/picture">
                         <pic:nvPicPr>
-                          <pic:cNvPr id="5002" name="hello.png"/>
+                          <pic:cNvPr id="5002" name="chrome-lab-hello.png"/>
                           <pic:cNvPicPr/>
                         </pic:nvPicPr>
                         <pic:blipFill>
@@ -4999,7 +4999,7 @@
                         <pic:spPr>
                           <a:xfrm>
                             <a:off x="0" y="0"/>
-                            <a:ext cx="5016500" cy="2486627"/>
+                            <a:ext cx="5016500" cy="3709701"/>
                           </a:xfrm>
                           <a:prstGeom prst="rect">
                             <a:avLst/>

</xml_diff>

<commit_message>
docs: sync docs, evidence and lab reports to v3 content and diagnosis page (#40)
Issue #40：
- 文档：README 目录写明 v1/v2/v3；api.md 开头补 /insights 与诊断接口；acceptance.md 完成项补 T17 与 v3 词表规模，并更新 #8 已完成；demo.md 第 4 步改为页面现行文案、内容来源标注 v1/v2/v3；development.md 补 10/26 维护项
- 报告生成：共有词数改由 review-path.txt 推导（v3 下两表各 80、共 20 个共有词、合计 140），不再写死 10；新增 insights_evidence() 解析诊断证据，实验二增加“学习诊断页”小节与图 8，实验三、四补“制品复用（ADR 0002）”说明
- 截图：shoot.mjs 支持只截元素，末尾改用模拟演示账户 sim_trend 截“近 14 天”与诊断页，概览统计图移到练习之前，避免脚本自身的作答改变数字；.gitignore 忽略浏览器临时配置目录
- 证据：导入 v3 后重跑 review-path、today-http、daily-http、insights-http（冷启动 7.8 s、预热后 0.39 s），更新 index.csv 的时间与说明
- 四个报告的实测数字与当前演示库一致（195 项测试全绿）

Co-authored-by: DeepSeek Harness <noreply@deepseek.com>
</commit_message>
<xml_diff>
--- a/docs/reports/实验一_Web框架搭建.docx
+++ b/docs/reports/实验一_Web框架搭建.docx
@@ -4113,6 +4113,30 @@
                 <w:szCs w:val="17"/>
               </w:rPr>
               <w:t xml:space="preserve">    app.register_blueprint(examples_bp)</w:t>
+            </w:r>
+          </w:p>
+          <w:p>
+            <w:pPr>
+              <w:pStyle w:val="Normal"/>
+              <w:widowControl/>
+              <w:spacing w:before="0" w:after="0" w:lineRule="auto" w:line="240"/>
+              <w:shd w:val="clear" w:color="auto" w:fill="F2F2F2"/>
+              <w:jc w:val="start"/>
+              <w:rPr>
+                <w:b w:val="0"/>
+                <w:sz w:val="17"/>
+                <w:szCs w:val="17"/>
+              </w:rPr>
+            </w:pPr>
+            <w:r>
+              <w:rPr>
+                <w:rFonts w:ascii="Courier New" w:hAnsi="Courier New" w:eastAsia="宋体" w:cs="Courier New"/>
+                <w:b w:val="0"/>
+                <w:bCs w:val="0"/>
+                <w:sz w:val="17"/>
+                <w:szCs w:val="17"/>
+              </w:rPr>
+              <w:t xml:space="preserve">    app.register_blueprint(insights_bp)</w:t>
             </w:r>
           </w:p>
           <w:p>

</xml_diff>

<commit_message>
docs: sync docs, evidence and lab reports to v3 content and diagnosis page (#40) (#41)
Issue #40：
- 文档：README 目录写明 v1/v2/v3；api.md 开头补 /insights 与诊断接口；acceptance.md 完成项补 T17 与 v3 词表规模，并更新 #8 已完成；demo.md 第 4 步改为页面现行文案、内容来源标注 v1/v2/v3；development.md 补 10/26 维护项
- 报告生成：共有词数改由 review-path.txt 推导（v3 下两表各 80、共 20 个共有词、合计 140），不再写死 10；新增 insights_evidence() 解析诊断证据，实验二增加“学习诊断页”小节与图 8，实验三、四补“制品复用（ADR 0002）”说明
- 截图：shoot.mjs 支持只截元素，末尾改用模拟演示账户 sim_trend 截“近 14 天”与诊断页，概览统计图移到练习之前，避免脚本自身的作答改变数字；.gitignore 忽略浏览器临时配置目录
- 证据：导入 v3 后重跑 review-path、today-http、daily-http、insights-http（冷启动 7.8 s、预热后 0.39 s），更新 index.csv 的时间与说明
- 四个报告的实测数字与当前演示库一致（195 项测试全绿）

Co-authored-by: DeepSeek Harness <noreply@deepseek.com>
</commit_message>
<xml_diff>
--- a/docs/reports/实验一_Web框架搭建.docx
+++ b/docs/reports/实验一_Web框架搭建.docx
@@ -4113,6 +4113,30 @@
                 <w:szCs w:val="17"/>
               </w:rPr>
               <w:t xml:space="preserve">    app.register_blueprint(examples_bp)</w:t>
+            </w:r>
+          </w:p>
+          <w:p>
+            <w:pPr>
+              <w:pStyle w:val="Normal"/>
+              <w:widowControl/>
+              <w:spacing w:before="0" w:after="0" w:lineRule="auto" w:line="240"/>
+              <w:shd w:val="clear" w:color="auto" w:fill="F2F2F2"/>
+              <w:jc w:val="start"/>
+              <w:rPr>
+                <w:b w:val="0"/>
+                <w:sz w:val="17"/>
+                <w:szCs w:val="17"/>
+              </w:rPr>
+            </w:pPr>
+            <w:r>
+              <w:rPr>
+                <w:rFonts w:ascii="Courier New" w:hAnsi="Courier New" w:eastAsia="宋体" w:cs="Courier New"/>
+                <w:b w:val="0"/>
+                <w:bCs w:val="0"/>
+                <w:sz w:val="17"/>
+                <w:szCs w:val="17"/>
+              </w:rPr>
+              <w:t xml:space="preserve">    app.register_blueprint(insights_bp)</w:t>
             </w:r>
           </w:p>
           <w:p>

</xml_diff>